<commit_message>
Update Term Project(12223552 서지민).docx
</commit_message>
<xml_diff>
--- a/docs/Term Project(12223552 서지민).docx
+++ b/docs/Term Project(12223552 서지민).docx
@@ -1674,9 +1674,6 @@
         </w:tabs>
         <w:spacing w:line="360" w:lineRule="auto"/>
         <w:ind w:right="200"/>
-        <w:rPr>
-          <w:rFonts w:hint="eastAsia"/>
-        </w:rPr>
       </w:pPr>
     </w:p>
     <w:p>
@@ -1785,7 +1782,6 @@
         <w:ind w:left="200" w:right="200"/>
         <w:jc w:val="distribute"/>
         <w:rPr>
-          <w:rFonts w:hint="eastAsia"/>
           <w:sz w:val="28"/>
           <w:szCs w:val="28"/>
         </w:rPr>
@@ -1807,34 +1803,34 @@
       </w:pPr>
       <w:r>
         <w:rPr>
-          <w:rFonts w:eastAsia="마루 부리 중간" w:hint="eastAsia"/>
+          <w:rFonts w:asciiTheme="minorHAnsi" w:eastAsiaTheme="minorHAnsi" w:hint="eastAsia"/>
           <w:b/>
           <w:sz w:val="28"/>
           <w:szCs w:val="28"/>
         </w:rPr>
-        <w:t>부록</w:t>
-      </w:r>
-      <w:r>
-        <w:rPr>
-          <w:rFonts w:eastAsia="마루 부리 중간" w:hint="eastAsia"/>
+        <w:t xml:space="preserve">부록: 생성형 </w:t>
+      </w:r>
+      <w:r>
+        <w:rPr>
+          <w:rFonts w:asciiTheme="minorHAnsi" w:eastAsiaTheme="minorHAnsi"/>
           <w:b/>
           <w:sz w:val="28"/>
           <w:szCs w:val="28"/>
         </w:rPr>
-        <w:t xml:space="preserve">: </w:t>
-      </w:r>
-      <w:r>
-        <w:rPr>
-          <w:rFonts w:eastAsia="마루 부리 중간" w:hint="eastAsia"/>
+        <w:t>AI</w:t>
+      </w:r>
+      <w:r>
+        <w:rPr>
+          <w:rFonts w:asciiTheme="minorHAnsi" w:eastAsiaTheme="minorHAnsi" w:hint="eastAsia"/>
           <w:b/>
           <w:sz w:val="28"/>
           <w:szCs w:val="28"/>
         </w:rPr>
-        <w:t>생성형</w:t>
-      </w:r>
-      <w:r>
-        <w:rPr>
-          <w:rFonts w:eastAsia="마루 부리 중간" w:hint="eastAsia"/>
+        <w:t xml:space="preserve"> 도구 활용 명세</w:t>
+      </w:r>
+      <w:r>
+        <w:rPr>
+          <w:rFonts w:asciiTheme="minorHAnsi" w:eastAsiaTheme="minorHAnsi"/>
           <w:b/>
           <w:sz w:val="28"/>
           <w:szCs w:val="28"/>
@@ -1843,91 +1839,48 @@
       </w:r>
       <w:r>
         <w:rPr>
-          <w:rFonts w:eastAsia="마루 부리 중간"/>
+          <w:rFonts w:asciiTheme="minorHAnsi" w:eastAsiaTheme="minorHAnsi" w:hint="eastAsia"/>
           <w:b/>
           <w:sz w:val="28"/>
           <w:szCs w:val="28"/>
         </w:rPr>
-        <w:t>AI</w:t>
-      </w:r>
-      <w:r>
-        <w:rPr>
-          <w:rFonts w:eastAsia="마루 부리 중간" w:hint="eastAsia"/>
+        <w:t xml:space="preserve">및 </w:t>
+      </w:r>
+      <w:proofErr w:type="spellStart"/>
+      <w:r>
+        <w:rPr>
+          <w:rFonts w:asciiTheme="minorHAnsi" w:eastAsiaTheme="minorHAnsi"/>
           <w:b/>
           <w:sz w:val="28"/>
           <w:szCs w:val="28"/>
         </w:rPr>
-        <w:t xml:space="preserve"> </w:t>
-      </w:r>
-      <w:r>
-        <w:rPr>
-          <w:rFonts w:eastAsia="마루 부리 중간" w:hint="eastAsia"/>
+        <w:t>Github</w:t>
+      </w:r>
+      <w:proofErr w:type="spellEnd"/>
+      <w:r>
+        <w:rPr>
+          <w:rFonts w:asciiTheme="minorHAnsi" w:eastAsiaTheme="minorHAnsi"/>
           <w:b/>
           <w:sz w:val="28"/>
           <w:szCs w:val="28"/>
         </w:rPr>
-        <w:t>도구</w:t>
-      </w:r>
-      <w:r>
-        <w:rPr>
-          <w:rFonts w:eastAsia="마루 부리 중간" w:hint="eastAsia"/>
-          <w:b/>
+        <w:t xml:space="preserve"> repo URL</w:t>
+      </w:r>
+      <w:r>
+        <w:rPr>
           <w:sz w:val="28"/>
           <w:szCs w:val="28"/>
         </w:rPr>
-        <w:t xml:space="preserve"> </w:t>
-      </w:r>
-      <w:r>
-        <w:rPr>
-          <w:rFonts w:eastAsia="마루 부리 중간" w:hint="eastAsia"/>
+        <w:tab/>
+      </w:r>
+      <w:r>
+        <w:rPr>
+          <w:rFonts w:ascii="마루 부리 중간" w:hint="eastAsia"/>
           <w:b/>
           <w:sz w:val="28"/>
           <w:szCs w:val="28"/>
         </w:rPr>
-        <w:t>활용</w:t>
-      </w:r>
-      <w:r>
-        <w:rPr>
-          <w:rFonts w:eastAsia="마루 부리 중간" w:hint="eastAsia"/>
-          <w:b/>
-          <w:sz w:val="28"/>
-          <w:szCs w:val="28"/>
-        </w:rPr>
-        <w:t xml:space="preserve"> </w:t>
-      </w:r>
-      <w:r>
-        <w:rPr>
-          <w:rFonts w:eastAsia="마루 부리 중간" w:hint="eastAsia"/>
-          <w:b/>
-          <w:sz w:val="28"/>
-          <w:szCs w:val="28"/>
-        </w:rPr>
-        <w:t>명세</w:t>
-      </w:r>
-      <w:r>
-        <w:rPr>
-          <w:sz w:val="28"/>
-          <w:szCs w:val="28"/>
-        </w:rPr>
-        <w:tab/>
-      </w:r>
-      <w:r>
-        <w:rPr>
-          <w:rFonts w:ascii="마루 부리 중간" w:hint="eastAsia"/>
-          <w:b/>
-          <w:sz w:val="28"/>
-          <w:szCs w:val="28"/>
-        </w:rPr>
-        <w:t>2</w:t>
-      </w:r>
-      <w:r>
-        <w:rPr>
-          <w:rFonts w:ascii="마루 부리 중간" w:hint="eastAsia"/>
-          <w:b/>
-          <w:sz w:val="28"/>
-          <w:szCs w:val="28"/>
-        </w:rPr>
-        <w:t>8</w:t>
+        <w:t>28</w:t>
       </w:r>
     </w:p>
     <w:p>
@@ -2008,7 +1961,7 @@
         <w:spacing w:line="240" w:lineRule="auto"/>
         <w:ind w:rightChars="100" w:right="200" w:firstLineChars="100" w:firstLine="240"/>
         <w:rPr>
-          <w:rFonts w:asciiTheme="minorHAnsi" w:eastAsiaTheme="minorHAnsi" w:hint="eastAsia"/>
+          <w:rFonts w:asciiTheme="minorHAnsi" w:eastAsiaTheme="minorHAnsi"/>
           <w:sz w:val="24"/>
           <w:shd w:val="clear" w:color="999999" w:fill="auto"/>
         </w:rPr>
@@ -3004,15 +2957,7 @@
           <w:sz w:val="24"/>
           <w:shd w:val="clear" w:color="999999" w:fill="auto"/>
         </w:rPr>
-        <w:t xml:space="preserve"> 사용하였다.</w:t>
-      </w:r>
-      <w:r>
-        <w:rPr>
-          <w:rFonts w:ascii="마루 부리 중간" w:eastAsia="마루 부리 중간"/>
-          <w:sz w:val="24"/>
-          <w:shd w:val="clear" w:color="999999" w:fill="auto"/>
-        </w:rPr>
-        <w:t xml:space="preserve"> </w:t>
+        <w:t xml:space="preserve"> 사용하였다. </w:t>
       </w:r>
       <w:r>
         <w:rPr>
@@ -3481,7 +3426,7 @@
           <w:noProof/>
         </w:rPr>
         <w:drawing>
-          <wp:inline distT="0" distB="0" distL="0" distR="0" wp14:anchorId="107022F0" wp14:editId="25582503">
+          <wp:inline distT="0" distB="0" distL="0" distR="0" wp14:anchorId="107022F0" wp14:editId="5BAAF173">
             <wp:extent cx="5398753" cy="1872566"/>
             <wp:effectExtent l="0" t="0" r="0" b="0"/>
             <wp:docPr id="1698912817" name="그림 1" descr="전체 크기 미리보기"/>
@@ -3655,7 +3600,7 @@
           <w:noProof/>
         </w:rPr>
         <w:drawing>
-          <wp:inline distT="0" distB="0" distL="0" distR="0" wp14:anchorId="0DA8D5F8" wp14:editId="7087D08A">
+          <wp:inline distT="0" distB="0" distL="0" distR="0" wp14:anchorId="0DA8D5F8" wp14:editId="259B8E33">
             <wp:extent cx="5399847" cy="2646387"/>
             <wp:effectExtent l="0" t="0" r="0" b="0"/>
             <wp:docPr id="1458070207" name="그림 2" descr="전체 크기 미리보기"/>
@@ -3990,7 +3935,7 @@
         </w:rPr>
         <w:lastRenderedPageBreak/>
         <w:drawing>
-          <wp:inline distT="0" distB="0" distL="0" distR="0" wp14:anchorId="7C5ABC62" wp14:editId="3156F87E">
+          <wp:inline distT="0" distB="0" distL="0" distR="0" wp14:anchorId="7C5ABC62" wp14:editId="1BA50AC9">
             <wp:extent cx="5400040" cy="1751330"/>
             <wp:effectExtent l="0" t="0" r="0" b="1270"/>
             <wp:docPr id="328350610" name="그림 3" descr="전체 크기 미리보기"/>
@@ -6296,6 +6241,9 @@
             <w:szCs w:val="24"/>
           </w:rPr>
           <w:t xml:space="preserve"> 모델로 활용하였다.</w:t>
+        </w:r>
+        <w:r>
+          <w:t>‬</w:t>
         </w:r>
         <w:r>
           <w:t>‬</w:t>
@@ -11377,7 +11325,7 @@
           <w:sz w:val="24"/>
         </w:rPr>
         <w:drawing>
-          <wp:inline distT="0" distB="0" distL="0" distR="0" wp14:anchorId="798BB1A1" wp14:editId="3E50804E">
+          <wp:inline distT="0" distB="0" distL="0" distR="0" wp14:anchorId="798BB1A1" wp14:editId="30C54998">
             <wp:extent cx="5776000" cy="2382520"/>
             <wp:effectExtent l="0" t="0" r="2540" b="5080"/>
             <wp:docPr id="1146022993" name="그림 5"/>
@@ -11427,24 +11375,14 @@
       <w:r>
         <w:t xml:space="preserve">Figure </w:t>
       </w:r>
-      <w:r>
-        <w:fldChar w:fldCharType="begin"/>
-      </w:r>
-      <w:r>
-        <w:instrText xml:space="preserve"> SEQ Figure \* ARABIC </w:instrText>
-      </w:r>
-      <w:r>
-        <w:fldChar w:fldCharType="separate"/>
-      </w:r>
-      <w:r>
-        <w:rPr>
-          <w:noProof/>
-        </w:rPr>
-        <w:t>2</w:t>
-      </w:r>
-      <w:r>
-        <w:fldChar w:fldCharType="end"/>
-      </w:r>
+      <w:fldSimple w:instr=" SEQ Figure \* ARABIC ">
+        <w:r>
+          <w:rPr>
+            <w:noProof/>
+          </w:rPr>
+          <w:t>2</w:t>
+        </w:r>
+      </w:fldSimple>
       <w:r>
         <w:rPr>
           <w:rFonts w:hint="eastAsia"/>
@@ -11470,7 +11408,7 @@
         </w:rPr>
         <w:lastRenderedPageBreak/>
         <w:drawing>
-          <wp:inline distT="0" distB="0" distL="0" distR="0" wp14:anchorId="4F3A733C" wp14:editId="183B8455">
+          <wp:inline distT="0" distB="0" distL="0" distR="0" wp14:anchorId="4F3A733C" wp14:editId="1D6E6FD7">
             <wp:extent cx="5783580" cy="2382715"/>
             <wp:effectExtent l="0" t="0" r="0" b="5080"/>
             <wp:docPr id="1295120550" name="그림 4"/>
@@ -11520,24 +11458,14 @@
       <w:r>
         <w:t xml:space="preserve">Figure </w:t>
       </w:r>
-      <w:r>
-        <w:fldChar w:fldCharType="begin"/>
-      </w:r>
-      <w:r>
-        <w:instrText xml:space="preserve"> SEQ Figure \* ARABIC </w:instrText>
-      </w:r>
-      <w:r>
-        <w:fldChar w:fldCharType="separate"/>
-      </w:r>
-      <w:r>
-        <w:rPr>
-          <w:noProof/>
-        </w:rPr>
-        <w:t>3</w:t>
-      </w:r>
-      <w:r>
-        <w:fldChar w:fldCharType="end"/>
-      </w:r>
+      <w:fldSimple w:instr=" SEQ Figure \* ARABIC ">
+        <w:r>
+          <w:rPr>
+            <w:noProof/>
+          </w:rPr>
+          <w:t>3</w:t>
+        </w:r>
+      </w:fldSimple>
       <w:r>
         <w:rPr>
           <w:rFonts w:hint="eastAsia"/>
@@ -14672,7 +14600,6 @@
       <w:pPr>
         <w:ind w:firstLineChars="100" w:firstLine="240"/>
         <w:rPr>
-          <w:rFonts w:hint="eastAsia"/>
           <w:sz w:val="24"/>
           <w:szCs w:val="24"/>
         </w:rPr>
@@ -17052,7 +16979,7 @@
         <w:spacing w:line="240" w:lineRule="auto"/>
         <w:ind w:firstLine="240"/>
         <w:rPr>
-          <w:rFonts w:ascii="마루 부리 중간" w:eastAsia="마루 부리 중간" w:hint="eastAsia"/>
+          <w:rFonts w:ascii="마루 부리 중간" w:eastAsia="마루 부리 중간"/>
           <w:sz w:val="24"/>
         </w:rPr>
       </w:pPr>
@@ -17409,7 +17336,6 @@
         <w:ind w:left="0"/>
         <w:jc w:val="both"/>
         <w:rPr>
-          <w:rFonts w:hint="eastAsia"/>
           <w:sz w:val="24"/>
           <w:szCs w:val="24"/>
         </w:rPr>
@@ -17854,14 +17780,39 @@
         </w:rPr>
         <w:t xml:space="preserve"> 도구 활용 명세</w:t>
       </w:r>
-    </w:p>
-    <w:p>
-      <w:pPr>
+      <w:r>
+        <w:rPr>
+          <w:sz w:val="34"/>
+          <w:szCs w:val="34"/>
+        </w:rPr>
+        <w:t xml:space="preserve"> </w:t>
+      </w:r>
+      <w:r>
         <w:rPr>
           <w:rFonts w:hint="eastAsia"/>
-        </w:rPr>
-      </w:pPr>
-    </w:p>
+          <w:sz w:val="34"/>
+          <w:szCs w:val="34"/>
+        </w:rPr>
+        <w:t xml:space="preserve">및 </w:t>
+      </w:r>
+      <w:proofErr w:type="spellStart"/>
+      <w:r>
+        <w:rPr>
+          <w:sz w:val="34"/>
+          <w:szCs w:val="34"/>
+        </w:rPr>
+        <w:t>Github</w:t>
+      </w:r>
+      <w:proofErr w:type="spellEnd"/>
+      <w:r>
+        <w:rPr>
+          <w:sz w:val="34"/>
+          <w:szCs w:val="34"/>
+        </w:rPr>
+        <w:t xml:space="preserve"> repo URL</w:t>
+      </w:r>
+    </w:p>
+    <w:p/>
     <w:p>
       <w:pPr>
         <w:rPr>
@@ -17925,19 +17876,56 @@
     <w:p>
       <w:pPr>
         <w:rPr>
+          <w:b/>
+          <w:bCs/>
+          <w:sz w:val="24"/>
+          <w:szCs w:val="24"/>
+        </w:rPr>
+      </w:pPr>
+      <w:r>
+        <w:rPr>
           <w:rFonts w:hint="eastAsia"/>
-          <w:sz w:val="24"/>
-          <w:szCs w:val="24"/>
-        </w:rPr>
-      </w:pPr>
-      <w:r>
-        <w:rPr>
-          <w:rFonts w:hint="eastAsia"/>
+          <w:color w:val="EE0000"/>
           <w:sz w:val="24"/>
           <w:szCs w:val="24"/>
         </w:rPr>
         <w:t xml:space="preserve"> </w:t>
       </w:r>
+      <w:hyperlink r:id="rId33" w:history="1">
+        <w:r>
+          <w:rPr>
+            <w:rStyle w:val="a7"/>
+            <w:b/>
+            <w:bCs/>
+            <w:color w:val="EE0000"/>
+            <w:sz w:val="24"/>
+            <w:szCs w:val="24"/>
+          </w:rPr>
+          <w:t>https://github.com/seojim</w:t>
+        </w:r>
+        <w:r>
+          <w:rPr>
+            <w:rStyle w:val="a7"/>
+            <w:b/>
+            <w:bCs/>
+            <w:color w:val="EE0000"/>
+            <w:sz w:val="24"/>
+            <w:szCs w:val="24"/>
+          </w:rPr>
+          <w:t>i</w:t>
+        </w:r>
+        <w:r>
+          <w:rPr>
+            <w:rStyle w:val="a7"/>
+            <w:b/>
+            <w:bCs/>
+            <w:color w:val="EE0000"/>
+            <w:sz w:val="24"/>
+            <w:szCs w:val="24"/>
+          </w:rPr>
+          <w:t>n03/Integration-Driver-Risk-Score-IDRS-.git</w:t>
+        </w:r>
+      </w:hyperlink>
     </w:p>
     <w:p>
       <w:pPr>
@@ -18467,23 +18455,7 @@
           <w:sz w:val="24"/>
           <w:szCs w:val="24"/>
         </w:rPr>
-        <w:t xml:space="preserve"> al., 2021 </w:t>
-      </w:r>
-      <w:proofErr w:type="gramStart"/>
-      <w:r>
-        <w:rPr>
-          <w:sz w:val="24"/>
-          <w:szCs w:val="24"/>
-        </w:rPr>
-        <w:t>등)는</w:t>
-      </w:r>
-      <w:proofErr w:type="gramEnd"/>
-      <w:r>
-        <w:rPr>
-          <w:sz w:val="24"/>
-          <w:szCs w:val="24"/>
-        </w:rPr>
-        <w:t xml:space="preserve"> 원논문을 직접 확인하여 표기하였다.</w:t>
+        <w:t xml:space="preserve"> al., 2021 등)는 원논문을 직접 확인하여 표기하였다.</w:t>
       </w:r>
     </w:p>
     <w:p>
@@ -18619,7 +18591,6 @@
       <w:pPr>
         <w:spacing w:line="360" w:lineRule="auto"/>
         <w:rPr>
-          <w:rFonts w:hint="eastAsia"/>
           <w:sz w:val="24"/>
           <w:szCs w:val="24"/>
         </w:rPr>
@@ -18766,7 +18737,6 @@
       <w:pPr>
         <w:spacing w:line="360" w:lineRule="auto"/>
         <w:rPr>
-          <w:rFonts w:hint="eastAsia"/>
           <w:sz w:val="24"/>
           <w:szCs w:val="24"/>
         </w:rPr>
@@ -19355,6 +19325,7 @@
   <w:style w:type="character" w:default="1" w:styleId="a0">
     <w:name w:val="Default Paragraph Font"/>
     <w:uiPriority w:val="1"/>
+    <w:semiHidden/>
     <w:unhideWhenUsed/>
   </w:style>
   <w:style w:type="table" w:default="1" w:styleId="a1">

</xml_diff>